<commit_message>
Update to da resume.
</commit_message>
<xml_diff>
--- a/resumes/resume_2026_bioinfo.docx
+++ b/resumes/resume_2026_bioinfo.docx
@@ -192,8 +192,89 @@
       </w:pPr>
       <w:r>
         <w:rPr>
-          <w:rtl w:val="0"/>
-        </w:rPr>
+          <w:b w:val="1"/>
+          <w:bCs w:val="1"/>
+          <w:rtl w:val="0"/>
+        </w:rPr>
+        <w:t xml:space="preserve">Content Classification:</w:t>
+      </w:r>
+      <w:r>
+        <w:rPr>
+          <w:rtl w:val="0"/>
+        </w:rPr>
+        <w:t xml:space="preserve"> Performed systematic classification and annotation of digital content to improve Content Brand Suitability standards across Meta's advertising ecosystem.</w:t>
+      </w:r>
+    </w:p>
+    <w:p>
+      <w:pPr>
+        <w:numPr>
+          <w:ilvl w:val="0"/>
+          <w:numId w:val="1"/>
+        </w:numPr>
+        <w:spacing w:before="0" w:lineRule="auto"/>
+        <w:ind w:left="360"/>
+      </w:pPr>
+      <w:r>
+        <w:rPr>
+          <w:b w:val="1"/>
+          <w:bCs w:val="1"/>
+          <w:rtl w:val="0"/>
+        </w:rPr>
+        <w:t xml:space="preserve">Content Labeling:</w:t>
+      </w:r>
+      <w:r>
+        <w:rPr>
+          <w:rtl w:val="0"/>
+        </w:rPr>
+        <w:t xml:space="preserve"> Evaluated and labeled content at scale, applying established guidelines to ensure brand-safe environments for advertisers.</w:t>
+      </w:r>
+    </w:p>
+    <w:p>
+      <w:pPr>
+        <w:numPr>
+          <w:ilvl w:val="0"/>
+          <w:numId w:val="1"/>
+        </w:numPr>
+        <w:spacing w:before="0" w:lineRule="auto"/>
+        <w:ind w:left="360"/>
+      </w:pPr>
+      <w:r>
+        <w:rPr>
+          <w:b w:val="1"/>
+          <w:bCs w:val="1"/>
+          <w:rtl w:val="0"/>
+        </w:rPr>
+        <w:t xml:space="preserve">Data Quality:</w:t>
+      </w:r>
+      <w:r>
+        <w:rPr>
+          <w:rtl w:val="0"/>
+        </w:rPr>
+        <w:t xml:space="preserve"> Contributed to data quality initiatives that feed into machine learning models for automated content moderation and suitability scoring.</w:t>
+      </w:r>
+    </w:p>
+    <w:p>
+      <w:pPr>
+        <w:numPr>
+          <w:ilvl w:val="0"/>
+          <w:numId w:val="1"/>
+        </w:numPr>
+        <w:spacing w:before="0" w:lineRule="auto"/>
+        <w:ind w:left="360"/>
+      </w:pPr>
+      <w:r>
+        <w:rPr>
+          <w:b w:val="1"/>
+          <w:bCs w:val="1"/>
+          <w:rtl w:val="0"/>
+        </w:rPr>
+        <w:t xml:space="preserve">Policy Refinement:</w:t>
+      </w:r>
+      <w:r>
+        <w:rPr>
+          <w:rtl w:val="0"/>
+        </w:rPr>
+        <w:t xml:space="preserve"> Collaborated with cross-functional teams to identify edge cases and provide feedback that refines classification frameworks and policy guidelines</w:t>
       </w:r>
     </w:p>
     <w:p>

</xml_diff>